<commit_message>
Add direct media tools to audio spectrogram labs
</commit_message>
<xml_diff>
--- a/huong-dan-lab5-audio-spectrogram-dwt.docx
+++ b/huong-dan-lab5-audio-spectrogram-dwt.docx
@@ -4,8 +4,7 @@
   <w:body>
     <w:p>
       <w:pPr>
-        <w:pStyle w:val="Title"/>
-        <w:spacing w:after="200"/>
+        <w:spacing w:before="0" w:after="280" w:line="240" w:lineRule="auto"/>
         <w:jc w:val="center"/>
       </w:pPr>
       <w:r>
@@ -13,24 +12,10 @@
           <w:rFonts w:ascii="Arial" w:hAnsi="Arial" w:cs="Arial"/>
           <w:b/>
           <w:i w:val="0"/>
-          <w:sz w:val="48"/>
+          <w:color w:val="111827"/>
+          <w:sz w:val="36"/>
         </w:rPr>
-        <w:t>Hướng dẫn thực hành Lab 5</w:t>
-      </w:r>
-    </w:p>
-    <w:p>
-      <w:pPr>
-        <w:spacing w:before="0" w:after="280" w:line="276" w:lineRule="auto"/>
-        <w:jc w:val="center"/>
-      </w:pPr>
-      <w:r>
-        <w:rPr>
-          <w:rFonts w:ascii="Arial" w:hAnsi="Arial" w:cs="Arial"/>
-          <w:b w:val="0"/>
-          <w:i w:val="0"/>
-          <w:sz w:val="22"/>
-        </w:rPr>
-        <w:t>Giấu ảnh vào audio bằng Inverse STFT và DWT</w:t>
+        <w:t>Huong dan thuc hanh Lab 5: audio-spectrogram-dwt</w:t>
       </w:r>
     </w:p>
     <w:p>
@@ -44,13 +29,12 @@
           <w:i w:val="0"/>
           <w:sz w:val="22"/>
         </w:rPr>
-        <w:t>Tài liệu này dùng cho bài Lab 5: audio-spectrogram-dwt. Bài lab yêu cầu sinh viên giấu một ảnh bí mật vào audio gốc. Ảnh được hoán vị ngẫu nhiên bằng một khóa chia sẻ, sau đó được xem như một spectrogram và dùng Inverse STFT để biến thành tín hiệu miền thời gian. Tiếp theo, audio gốc được phân rã bằng DWT nhiều mức, tín hiệu bí mật được ghi đè trực tiếp vào hệ số chi tiết ở mức cuối, rồi IDWT được dùng để tạo audio stego.</w:t>
+        <w:t>Tai lieu nay ap dung cho Lab 5: audio-spectrogram-dwt.</w:t>
       </w:r>
     </w:p>
     <w:p>
       <w:pPr>
-        <w:pStyle w:val="ListBullet"/>
-        <w:spacing w:before="0" w:after="80" w:line="276" w:lineRule="auto"/>
+        <w:spacing w:before="0" w:after="160" w:line="276" w:lineRule="auto"/>
       </w:pPr>
       <w:r>
         <w:rPr>
@@ -59,74 +43,29 @@
           <w:i w:val="0"/>
           <w:sz w:val="22"/>
         </w:rPr>
-        <w:t>Lab 5: audio-spectrogram-dwt</w:t>
+        <w:t>Bai lab tao cover.wav, tao secret.png, bien anh thanh tin hieu mien thoi gian bang Inverse STFT va nhung vao phan tan so cao cua audio bang DWT.</w:t>
       </w:r>
     </w:p>
     <w:p>
       <w:pPr>
-        <w:pStyle w:val="ListBullet"/>
-        <w:spacing w:before="0" w:after="80" w:line="276" w:lineRule="auto"/>
-      </w:pPr>
-      <w:r>
-        <w:rPr>
-          <w:rFonts w:ascii="Arial" w:hAnsi="Arial" w:cs="Arial"/>
-          <w:b w:val="0"/>
-          <w:i w:val="0"/>
-          <w:sz w:val="22"/>
-        </w:rPr>
-        <w:t>Bài lab dùng một container duy nhất.</w:t>
-      </w:r>
-    </w:p>
-    <w:p>
-      <w:pPr>
-        <w:pStyle w:val="ListBullet"/>
-        <w:spacing w:before="0" w:after="80" w:line="276" w:lineRule="auto"/>
-      </w:pPr>
-      <w:r>
-        <w:rPr>
-          <w:rFonts w:ascii="Arial" w:hAnsi="Arial" w:cs="Arial"/>
-          <w:b w:val="0"/>
-          <w:i w:val="0"/>
-          <w:sz w:val="22"/>
-        </w:rPr>
-        <w:t>Nếu sinh viên muốn làm lại từ đầu, dùng lệnh labtainer -r audio-spectrogram-dwt.</w:t>
-      </w:r>
-    </w:p>
-    <w:p>
-      <w:pPr>
-        <w:pStyle w:val="Heading1"/>
-        <w:spacing w:before="360" w:after="160"/>
+        <w:spacing w:before="200" w:after="120" w:line="240" w:lineRule="auto"/>
       </w:pPr>
       <w:r>
         <w:rPr>
           <w:rFonts w:ascii="Arial" w:hAnsi="Arial" w:cs="Arial"/>
           <w:b/>
           <w:i w:val="0"/>
-          <w:sz w:val="32"/>
+          <w:color w:val="1F2937"/>
+          <w:sz w:val="26"/>
         </w:rPr>
-        <w:t>Lab 5: audio-spectrogram-dwt</w:t>
-      </w:r>
-    </w:p>
-    <w:p>
-      <w:pPr>
-        <w:pStyle w:val="Heading2"/>
-        <w:spacing w:before="280" w:after="120"/>
-      </w:pPr>
-      <w:r>
-        <w:rPr>
-          <w:rFonts w:ascii="Arial" w:hAnsi="Arial" w:cs="Arial"/>
-          <w:b/>
-          <w:i w:val="0"/>
-          <w:sz w:val="28"/>
-        </w:rPr>
-        <w:t>Tải bài lab</w:t>
+        <w:t>Tai Bai Lab</w:t>
       </w:r>
     </w:p>
     <w:p>
       <w:pPr>
         <w:spacing w:before="60" w:after="160" w:line="240" w:lineRule="auto"/>
         <w:ind w:left="360" w:right="360"/>
-        <w:shd w:fill="F5F5F5"/>
+        <w:shd w:fill="F3F4F6"/>
       </w:pPr>
       <w:r>
         <w:rPr>
@@ -140,38 +79,24 @@
     </w:p>
     <w:p>
       <w:pPr>
-        <w:pStyle w:val="Heading2"/>
-        <w:spacing w:before="280" w:after="120"/>
+        <w:spacing w:before="200" w:after="120" w:line="240" w:lineRule="auto"/>
       </w:pPr>
       <w:r>
         <w:rPr>
           <w:rFonts w:ascii="Arial" w:hAnsi="Arial" w:cs="Arial"/>
           <w:b/>
           <w:i w:val="0"/>
-          <w:sz w:val="28"/>
+          <w:color w:val="1F2937"/>
+          <w:sz w:val="26"/>
         </w:rPr>
-        <w:t>Khởi động bài lab</w:t>
-      </w:r>
-    </w:p>
-    <w:p>
-      <w:pPr>
-        <w:spacing w:before="0" w:after="160" w:line="276" w:lineRule="auto"/>
-      </w:pPr>
-      <w:r>
-        <w:rPr>
-          <w:rFonts w:ascii="Arial" w:hAnsi="Arial" w:cs="Arial"/>
-          <w:b w:val="0"/>
-          <w:i w:val="0"/>
-          <w:sz w:val="22"/>
-        </w:rPr>
-        <w:t>Vào terminal, gõ:</w:t>
+        <w:t>Khoi Dong</w:t>
       </w:r>
     </w:p>
     <w:p>
       <w:pPr>
         <w:spacing w:before="60" w:after="160" w:line="240" w:lineRule="auto"/>
         <w:ind w:left="360" w:right="360"/>
-        <w:shd w:fill="F5F5F5"/>
+        <w:shd w:fill="F3F4F6"/>
       </w:pPr>
       <w:r>
         <w:rPr>
@@ -194,7 +119,7 @@
           <w:i w:val="0"/>
           <w:sz w:val="22"/>
         </w:rPr>
-        <w:t>Chú ý: sinh viên sử dụng mã sinh viên của mình để nhập thông tin email/người thực hiện bài lab khi có yêu cầu. Hệ thống sẽ tự chuẩn hoá mã đó sang dạng IN HOA và ghi nhớ ID gần nhất.</w:t>
+        <w:t>Khi duoc hoi e-mail/student id, sinh vien nhap ma sinh vien cua minh. He thong se tu chuan hoa ma do sang dang IN HOA va ghi nho ID gan nhat.</w:t>
       </w:r>
     </w:p>
     <w:p>
@@ -222,48 +147,22 @@
           <w:i w:val="0"/>
           <w:sz w:val="22"/>
         </w:rPr>
-        <w:t>Sau khi khởi động xong, trong thư mục ~/stego có các file hỗ trợ thực hành, ví dụ:</w:t>
+        <w:t>Trong thu muc ~/stego co cac file thuc hanh nhu generate_cover.py, generate_secret_image.py, embed_task.py, analyze_audio.py, refresh_status.py va cac script view/play moi.</w:t>
       </w:r>
     </w:p>
     <w:p>
       <w:pPr>
-        <w:spacing w:before="60" w:after="160" w:line="240" w:lineRule="auto"/>
-        <w:ind w:left="360" w:right="360"/>
-        <w:shd w:fill="F5F5F5"/>
-      </w:pPr>
-      <w:r>
-        <w:rPr>
-          <w:rFonts w:ascii="Consolas" w:hAnsi="Consolas" w:cs="Consolas"/>
-          <w:b w:val="0"/>
-          <w:i w:val="0"/>
-          <w:sz w:val="20"/>
-        </w:rPr>
-        <w:t>generate_cover.py</w:t>
-        <w:br/>
-        <w:t>generate_secret_image.py</w:t>
-        <w:br/>
-        <w:t>spectrogram_dwt_stego.py</w:t>
-        <w:br/>
-        <w:t>embed_task.py</w:t>
-        <w:br/>
-        <w:t>analyze_audio.py</w:t>
-        <w:br/>
-        <w:t>refresh_status.py</w:t>
-      </w:r>
-    </w:p>
-    <w:p>
-      <w:pPr>
-        <w:pStyle w:val="Heading2"/>
-        <w:spacing w:before="280" w:after="120"/>
+        <w:spacing w:before="200" w:after="120" w:line="240" w:lineRule="auto"/>
       </w:pPr>
       <w:r>
         <w:rPr>
           <w:rFonts w:ascii="Arial" w:hAnsi="Arial" w:cs="Arial"/>
           <w:b/>
           <w:i w:val="0"/>
-          <w:sz w:val="28"/>
+          <w:color w:val="1F2937"/>
+          <w:sz w:val="26"/>
         </w:rPr>
-        <w:t>Mục tiêu bài lab</w:t>
+        <w:t>Muc tieu bai lab</w:t>
       </w:r>
     </w:p>
     <w:p>
@@ -278,7 +177,7 @@
           <w:i w:val="0"/>
           <w:sz w:val="22"/>
         </w:rPr>
-        <w:t>Tạo file audio gốc cover.wav.</w:t>
+        <w:t>Tao file audio goc cover.wav.</w:t>
       </w:r>
     </w:p>
     <w:p>
@@ -293,7 +192,7 @@
           <w:i w:val="0"/>
           <w:sz w:val="22"/>
         </w:rPr>
-        <w:t>Tạo ảnh bí mật secret.png.</w:t>
+        <w:t>Tao anh bi mat secret.png.</w:t>
       </w:r>
     </w:p>
     <w:p>
@@ -308,7 +207,7 @@
           <w:i w:val="0"/>
           <w:sz w:val="22"/>
         </w:rPr>
-        <w:t>Sửa file embed_task.py, điền đúng tên file audio gốc và ảnh bí mật.</w:t>
+        <w:t>Mo truc tiep secret.png de quan sat.</w:t>
       </w:r>
     </w:p>
     <w:p>
@@ -323,7 +222,7 @@
           <w:i w:val="0"/>
           <w:sz w:val="22"/>
         </w:rPr>
-        <w:t>Chạy chương trình nhúng tin để tạo stego.wav.</w:t>
+        <w:t>Sua file embed_task.py, dien dung ten file audio goc va anh bi mat.</w:t>
       </w:r>
     </w:p>
     <w:p>
@@ -338,7 +237,7 @@
           <w:i w:val="0"/>
           <w:sz w:val="22"/>
         </w:rPr>
-        <w:t>Kiểm tra stego.wav đã được tạo và khác cover.wav.</w:t>
+        <w:t>Chay chuong trinh nhung tin de tao stego.wav.</w:t>
       </w:r>
     </w:p>
     <w:p>
@@ -353,22 +252,107 @@
           <w:i w:val="0"/>
           <w:sz w:val="22"/>
         </w:rPr>
-        <w:t>Chạy checkwork để kiểm tra kết quả.</w:t>
+        <w:t>Co the nghe truc tiep cover.wav va stego.wav.</w:t>
       </w:r>
     </w:p>
     <w:p>
       <w:pPr>
-        <w:pStyle w:val="Heading2"/>
-        <w:spacing w:before="280" w:after="120"/>
+        <w:pStyle w:val="ListNumber"/>
+        <w:spacing w:before="0" w:after="80" w:line="276" w:lineRule="auto"/>
+      </w:pPr>
+      <w:r>
+        <w:rPr>
+          <w:rFonts w:ascii="Arial" w:hAnsi="Arial" w:cs="Arial"/>
+          <w:b w:val="0"/>
+          <w:i w:val="0"/>
+          <w:sz w:val="22"/>
+        </w:rPr>
+        <w:t>Kiem tra stego.wav da duoc tao va khac cover.wav.</w:t>
+      </w:r>
+    </w:p>
+    <w:p>
+      <w:pPr>
+        <w:pStyle w:val="ListNumber"/>
+        <w:spacing w:before="0" w:after="80" w:line="276" w:lineRule="auto"/>
+      </w:pPr>
+      <w:r>
+        <w:rPr>
+          <w:rFonts w:ascii="Arial" w:hAnsi="Arial" w:cs="Arial"/>
+          <w:b w:val="0"/>
+          <w:i w:val="0"/>
+          <w:sz w:val="22"/>
+        </w:rPr>
+        <w:t>Chay checkwork de kiem tra ket qua.</w:t>
+      </w:r>
+    </w:p>
+    <w:p>
+      <w:pPr>
+        <w:spacing w:before="160" w:after="80" w:line="240" w:lineRule="auto"/>
       </w:pPr>
       <w:r>
         <w:rPr>
           <w:rFonts w:ascii="Arial" w:hAnsi="Arial" w:cs="Arial"/>
           <w:b/>
           <w:i w:val="0"/>
-          <w:sz w:val="28"/>
+          <w:color w:val="374151"/>
+          <w:sz w:val="22"/>
         </w:rPr>
-        <w:t>Nội dung kỹ thuật</w:t>
+        <w:t>Task 1: Tao file audio goc</w:t>
+      </w:r>
+    </w:p>
+    <w:p>
+      <w:pPr>
+        <w:spacing w:before="60" w:after="160" w:line="240" w:lineRule="auto"/>
+        <w:ind w:left="360" w:right="360"/>
+        <w:shd w:fill="F3F4F6"/>
+      </w:pPr>
+      <w:r>
+        <w:rPr>
+          <w:rFonts w:ascii="Consolas" w:hAnsi="Consolas" w:cs="Consolas"/>
+          <w:b w:val="0"/>
+          <w:i w:val="0"/>
+          <w:sz w:val="20"/>
+        </w:rPr>
+        <w:t>cd ~/stego</w:t>
+        <w:br/>
+        <w:t>python3 generate_cover.py --out cover.wav</w:t>
+        <w:br/>
+        <w:t>ls -l cover.wav</w:t>
+      </w:r>
+    </w:p>
+    <w:p>
+      <w:pPr>
+        <w:spacing w:before="160" w:after="80" w:line="240" w:lineRule="auto"/>
+      </w:pPr>
+      <w:r>
+        <w:rPr>
+          <w:rFonts w:ascii="Arial" w:hAnsi="Arial" w:cs="Arial"/>
+          <w:b/>
+          <w:i w:val="0"/>
+          <w:color w:val="374151"/>
+          <w:sz w:val="22"/>
+        </w:rPr>
+        <w:t>Task 2: Tao anh bi mat</w:t>
+      </w:r>
+    </w:p>
+    <w:p>
+      <w:pPr>
+        <w:spacing w:before="60" w:after="160" w:line="240" w:lineRule="auto"/>
+        <w:ind w:left="360" w:right="360"/>
+        <w:shd w:fill="F3F4F6"/>
+      </w:pPr>
+      <w:r>
+        <w:rPr>
+          <w:rFonts w:ascii="Consolas" w:hAnsi="Consolas" w:cs="Consolas"/>
+          <w:b w:val="0"/>
+          <w:i w:val="0"/>
+          <w:sz w:val="20"/>
+        </w:rPr>
+        <w:t>python3 generate_secret_image.py --out secret.png</w:t>
+        <w:br/>
+        <w:t>ls -l secret.png</w:t>
+        <w:br/>
+        <w:t>file secret.png</w:t>
       </w:r>
     </w:p>
     <w:p>
@@ -382,14 +366,14 @@
           <w:i w:val="0"/>
           <w:sz w:val="22"/>
         </w:rPr>
-        <w:t>Quy trình nhúng tin của bài lab:</w:t>
+        <w:t>De mo truc tiep anh trong lab:</w:t>
       </w:r>
     </w:p>
     <w:p>
       <w:pPr>
         <w:spacing w:before="60" w:after="160" w:line="240" w:lineRule="auto"/>
         <w:ind w:left="360" w:right="360"/>
-        <w:shd w:fill="F5F5F5"/>
+        <w:shd w:fill="F3F4F6"/>
       </w:pPr>
       <w:r>
         <w:rPr>
@@ -398,360 +382,29 @@
           <w:i w:val="0"/>
           <w:sz w:val="20"/>
         </w:rPr>
-        <w:t>Ảnh bí mật</w:t>
-        <w:br/>
-        <w:t>→ hoán vị ngẫu nhiên bằng key</w:t>
-        <w:br/>
-        <w:t>→ xem như spectrogram</w:t>
-        <w:br/>
-        <w:t>→ Inverse STFT</w:t>
-        <w:br/>
-        <w:t>→ tín hiệu miền thời gian</w:t>
-        <w:br/>
-        <w:t>→ DWT nhiều mức audio gốc</w:t>
-        <w:br/>
-        <w:t>→ ghi đè detail coefficients mức cuối</w:t>
-        <w:br/>
-        <w:t>→ IDWT</w:t>
-        <w:br/>
-        <w:t>→ audio stego</w:t>
+        <w:t>./view_secret.sh</w:t>
       </w:r>
     </w:p>
     <w:p>
       <w:pPr>
-        <w:spacing w:before="0" w:after="160" w:line="276" w:lineRule="auto"/>
-      </w:pPr>
-      <w:r>
-        <w:rPr>
-          <w:rFonts w:ascii="Arial" w:hAnsi="Arial" w:cs="Arial"/>
-          <w:b w:val="0"/>
-          <w:i w:val="0"/>
-          <w:sz w:val="22"/>
-        </w:rPr>
-        <w:t>Ý nghĩa các bước:</w:t>
-      </w:r>
-    </w:p>
-    <w:p>
-      <w:pPr>
-        <w:pStyle w:val="ListBullet"/>
-        <w:spacing w:before="0" w:after="80" w:line="276" w:lineRule="auto"/>
-      </w:pPr>
-      <w:r>
-        <w:rPr>
-          <w:rFonts w:ascii="Arial" w:hAnsi="Arial" w:cs="Arial"/>
-          <w:b w:val="0"/>
-          <w:i w:val="0"/>
-          <w:sz w:val="22"/>
-        </w:rPr>
-        <w:t>secret.png: ảnh bí mật cần nhúng.</w:t>
-      </w:r>
-    </w:p>
-    <w:p>
-      <w:pPr>
-        <w:pStyle w:val="ListBullet"/>
-        <w:spacing w:before="0" w:after="80" w:line="276" w:lineRule="auto"/>
-      </w:pPr>
-      <w:r>
-        <w:rPr>
-          <w:rFonts w:ascii="Arial" w:hAnsi="Arial" w:cs="Arial"/>
-          <w:b w:val="0"/>
-          <w:i w:val="0"/>
-          <w:sz w:val="22"/>
-        </w:rPr>
-        <w:t>Hoán vị bằng key: trộn vị trí các điểm ảnh bằng khóa dùng chung giữa bên gửi và bên nhận.</w:t>
-      </w:r>
-    </w:p>
-    <w:p>
-      <w:pPr>
-        <w:pStyle w:val="ListBullet"/>
-        <w:spacing w:before="0" w:after="80" w:line="276" w:lineRule="auto"/>
-      </w:pPr>
-      <w:r>
-        <w:rPr>
-          <w:rFonts w:ascii="Arial" w:hAnsi="Arial" w:cs="Arial"/>
-          <w:b w:val="0"/>
-          <w:i w:val="0"/>
-          <w:sz w:val="22"/>
-        </w:rPr>
-        <w:t>Spectrogram: biểu diễn ảnh như một ma trận biên độ tần số-thời gian.</w:t>
-      </w:r>
-    </w:p>
-    <w:p>
-      <w:pPr>
-        <w:pStyle w:val="ListBullet"/>
-        <w:spacing w:before="0" w:after="80" w:line="276" w:lineRule="auto"/>
-      </w:pPr>
-      <w:r>
-        <w:rPr>
-          <w:rFonts w:ascii="Arial" w:hAnsi="Arial" w:cs="Arial"/>
-          <w:b w:val="0"/>
-          <w:i w:val="0"/>
-          <w:sz w:val="22"/>
-        </w:rPr>
-        <w:t>Inverse STFT: biến spectrogram thành tín hiệu miền thời gian.</w:t>
-      </w:r>
-    </w:p>
-    <w:p>
-      <w:pPr>
-        <w:pStyle w:val="ListBullet"/>
-        <w:spacing w:before="0" w:after="80" w:line="276" w:lineRule="auto"/>
-      </w:pPr>
-      <w:r>
-        <w:rPr>
-          <w:rFonts w:ascii="Arial" w:hAnsi="Arial" w:cs="Arial"/>
-          <w:b w:val="0"/>
-          <w:i w:val="0"/>
-          <w:sz w:val="22"/>
-        </w:rPr>
-        <w:t>DWT nhiều mức: phân rã audio gốc thành hệ số xấp xỉ và các hệ số chi tiết qua nhiều mức.</w:t>
-      </w:r>
-    </w:p>
-    <w:p>
-      <w:pPr>
-        <w:pStyle w:val="ListBullet"/>
-        <w:spacing w:before="0" w:after="80" w:line="276" w:lineRule="auto"/>
-      </w:pPr>
-      <w:r>
-        <w:rPr>
-          <w:rFonts w:ascii="Arial" w:hAnsi="Arial" w:cs="Arial"/>
-          <w:b w:val="0"/>
-          <w:i w:val="0"/>
-          <w:sz w:val="22"/>
-        </w:rPr>
-        <w:t>Ghi đè hệ số chi tiết: dùng tín hiệu bí mật để thay trực tiếp hệ số chi tiết ở mức phân rã cuối.</w:t>
-      </w:r>
-    </w:p>
-    <w:p>
-      <w:pPr>
-        <w:pStyle w:val="ListBullet"/>
-        <w:spacing w:before="0" w:after="80" w:line="276" w:lineRule="auto"/>
-      </w:pPr>
-      <w:r>
-        <w:rPr>
-          <w:rFonts w:ascii="Arial" w:hAnsi="Arial" w:cs="Arial"/>
-          <w:b w:val="0"/>
-          <w:i w:val="0"/>
-          <w:sz w:val="22"/>
-        </w:rPr>
-        <w:t>IDWT: tái tạo lại audio sau khi đã nhúng tin.</w:t>
-      </w:r>
-    </w:p>
-    <w:p>
-      <w:pPr>
-        <w:pStyle w:val="Heading3"/>
-        <w:spacing w:before="200" w:after="80"/>
+        <w:spacing w:before="160" w:after="80" w:line="240" w:lineRule="auto"/>
       </w:pPr>
       <w:r>
         <w:rPr>
           <w:rFonts w:ascii="Arial" w:hAnsi="Arial" w:cs="Arial"/>
           <w:b/>
           <w:i w:val="0"/>
-          <w:sz w:val="24"/>
-        </w:rPr>
-        <w:t>Task 1: Tạo file audio gốc</w:t>
-      </w:r>
-    </w:p>
-    <w:p>
-      <w:pPr>
-        <w:spacing w:before="0" w:after="160" w:line="276" w:lineRule="auto"/>
-      </w:pPr>
-      <w:r>
-        <w:rPr>
-          <w:rFonts w:ascii="Arial" w:hAnsi="Arial" w:cs="Arial"/>
-          <w:b w:val="0"/>
-          <w:i w:val="0"/>
+          <w:color w:val="374151"/>
           <w:sz w:val="22"/>
         </w:rPr>
-        <w:t>Trong terminal của lab, gõ:</w:t>
+        <w:t>Task 3: Sua embed_task.py</w:t>
       </w:r>
     </w:p>
     <w:p>
       <w:pPr>
         <w:spacing w:before="60" w:after="160" w:line="240" w:lineRule="auto"/>
         <w:ind w:left="360" w:right="360"/>
-        <w:shd w:fill="F5F5F5"/>
-      </w:pPr>
-      <w:r>
-        <w:rPr>
-          <w:rFonts w:ascii="Consolas" w:hAnsi="Consolas" w:cs="Consolas"/>
-          <w:b w:val="0"/>
-          <w:i w:val="0"/>
-          <w:sz w:val="20"/>
-        </w:rPr>
-        <w:t>cd ~/stego</w:t>
-        <w:br/>
-        <w:t>python3 generate_cover.py --out cover.wav</w:t>
-      </w:r>
-    </w:p>
-    <w:p>
-      <w:pPr>
-        <w:spacing w:before="0" w:after="160" w:line="276" w:lineRule="auto"/>
-      </w:pPr>
-      <w:r>
-        <w:rPr>
-          <w:rFonts w:ascii="Arial" w:hAnsi="Arial" w:cs="Arial"/>
-          <w:b w:val="0"/>
-          <w:i w:val="0"/>
-          <w:sz w:val="22"/>
-        </w:rPr>
-        <w:t>Kiểm tra file đã được tạo:</w:t>
-      </w:r>
-    </w:p>
-    <w:p>
-      <w:pPr>
-        <w:spacing w:before="60" w:after="160" w:line="240" w:lineRule="auto"/>
-        <w:ind w:left="360" w:right="360"/>
-        <w:shd w:fill="F5F5F5"/>
-      </w:pPr>
-      <w:r>
-        <w:rPr>
-          <w:rFonts w:ascii="Consolas" w:hAnsi="Consolas" w:cs="Consolas"/>
-          <w:b w:val="0"/>
-          <w:i w:val="0"/>
-          <w:sz w:val="20"/>
-        </w:rPr>
-        <w:t>ls -l cover.wav</w:t>
-      </w:r>
-    </w:p>
-    <w:p>
-      <w:pPr>
-        <w:pStyle w:val="Heading3"/>
-        <w:spacing w:before="200" w:after="80"/>
-      </w:pPr>
-      <w:r>
-        <w:rPr>
-          <w:rFonts w:ascii="Arial" w:hAnsi="Arial" w:cs="Arial"/>
-          <w:b/>
-          <w:i w:val="0"/>
-          <w:sz w:val="24"/>
-        </w:rPr>
-        <w:t>Task 2: Tạo ảnh bí mật</w:t>
-      </w:r>
-    </w:p>
-    <w:p>
-      <w:pPr>
-        <w:spacing w:before="0" w:after="160" w:line="276" w:lineRule="auto"/>
-      </w:pPr>
-      <w:r>
-        <w:rPr>
-          <w:rFonts w:ascii="Arial" w:hAnsi="Arial" w:cs="Arial"/>
-          <w:b w:val="0"/>
-          <w:i w:val="0"/>
-          <w:sz w:val="22"/>
-        </w:rPr>
-        <w:t>Trong terminal của lab, gõ:</w:t>
-      </w:r>
-    </w:p>
-    <w:p>
-      <w:pPr>
-        <w:spacing w:before="60" w:after="160" w:line="240" w:lineRule="auto"/>
-        <w:ind w:left="360" w:right="360"/>
-        <w:shd w:fill="F5F5F5"/>
-      </w:pPr>
-      <w:r>
-        <w:rPr>
-          <w:rFonts w:ascii="Consolas" w:hAnsi="Consolas" w:cs="Consolas"/>
-          <w:b w:val="0"/>
-          <w:i w:val="0"/>
-          <w:sz w:val="20"/>
-        </w:rPr>
-        <w:t>python3 generate_secret_image.py --out secret.png</w:t>
-      </w:r>
-    </w:p>
-    <w:p>
-      <w:pPr>
-        <w:spacing w:before="0" w:after="160" w:line="276" w:lineRule="auto"/>
-      </w:pPr>
-      <w:r>
-        <w:rPr>
-          <w:rFonts w:ascii="Arial" w:hAnsi="Arial" w:cs="Arial"/>
-          <w:b w:val="0"/>
-          <w:i w:val="0"/>
-          <w:sz w:val="22"/>
-        </w:rPr>
-        <w:t>Kiểm tra file ảnh đã được tạo:</w:t>
-      </w:r>
-    </w:p>
-    <w:p>
-      <w:pPr>
-        <w:spacing w:before="60" w:after="160" w:line="240" w:lineRule="auto"/>
-        <w:ind w:left="360" w:right="360"/>
-        <w:shd w:fill="F5F5F5"/>
-      </w:pPr>
-      <w:r>
-        <w:rPr>
-          <w:rFonts w:ascii="Consolas" w:hAnsi="Consolas" w:cs="Consolas"/>
-          <w:b w:val="0"/>
-          <w:i w:val="0"/>
-          <w:sz w:val="20"/>
-        </w:rPr>
-        <w:t>ls -l secret.png</w:t>
-      </w:r>
-    </w:p>
-    <w:p>
-      <w:pPr>
-        <w:spacing w:before="0" w:after="160" w:line="276" w:lineRule="auto"/>
-      </w:pPr>
-      <w:r>
-        <w:rPr>
-          <w:rFonts w:ascii="Arial" w:hAnsi="Arial" w:cs="Arial"/>
-          <w:b w:val="0"/>
-          <w:i w:val="0"/>
-          <w:sz w:val="22"/>
-        </w:rPr>
-        <w:t>Nếu muốn xem nhanh thông tin file ảnh, có thể dùng:</w:t>
-      </w:r>
-    </w:p>
-    <w:p>
-      <w:pPr>
-        <w:spacing w:before="60" w:after="160" w:line="240" w:lineRule="auto"/>
-        <w:ind w:left="360" w:right="360"/>
-        <w:shd w:fill="F5F5F5"/>
-      </w:pPr>
-      <w:r>
-        <w:rPr>
-          <w:rFonts w:ascii="Consolas" w:hAnsi="Consolas" w:cs="Consolas"/>
-          <w:b w:val="0"/>
-          <w:i w:val="0"/>
-          <w:sz w:val="20"/>
-        </w:rPr>
-        <w:t>file secret.png</w:t>
-      </w:r>
-    </w:p>
-    <w:p>
-      <w:pPr>
-        <w:pStyle w:val="Heading3"/>
-        <w:spacing w:before="200" w:after="80"/>
-      </w:pPr>
-      <w:r>
-        <w:rPr>
-          <w:rFonts w:ascii="Arial" w:hAnsi="Arial" w:cs="Arial"/>
-          <w:b/>
-          <w:i w:val="0"/>
-          <w:sz w:val="24"/>
-        </w:rPr>
-        <w:t>Task 3: Sửa code để điền tên file audio, ảnh bí mật và kiểm tra khóa</w:t>
-      </w:r>
-    </w:p>
-    <w:p>
-      <w:pPr>
-        <w:spacing w:before="0" w:after="160" w:line="276" w:lineRule="auto"/>
-      </w:pPr>
-      <w:r>
-        <w:rPr>
-          <w:rFonts w:ascii="Arial" w:hAnsi="Arial" w:cs="Arial"/>
-          <w:b w:val="0"/>
-          <w:i w:val="0"/>
-          <w:sz w:val="22"/>
-        </w:rPr>
-        <w:t>Mở file embed_task.py:</w:t>
-      </w:r>
-    </w:p>
-    <w:p>
-      <w:pPr>
-        <w:spacing w:before="60" w:after="160" w:line="240" w:lineRule="auto"/>
-        <w:ind w:left="360" w:right="360"/>
-        <w:shd w:fill="F5F5F5"/>
+        <w:shd w:fill="F3F4F6"/>
       </w:pPr>
       <w:r>
         <w:rPr>
@@ -774,46 +427,14 @@
           <w:i w:val="0"/>
           <w:sz w:val="22"/>
         </w:rPr>
-        <w:t>Tìm các dòng TODO:</w:t>
+        <w:t>Sua hai dong TODO thanh:</w:t>
       </w:r>
     </w:p>
     <w:p>
       <w:pPr>
         <w:spacing w:before="60" w:after="160" w:line="240" w:lineRule="auto"/>
         <w:ind w:left="360" w:right="360"/>
-        <w:shd w:fill="F5F5F5"/>
-      </w:pPr>
-      <w:r>
-        <w:rPr>
-          <w:rFonts w:ascii="Consolas" w:hAnsi="Consolas" w:cs="Consolas"/>
-          <w:b w:val="0"/>
-          <w:i w:val="0"/>
-          <w:sz w:val="20"/>
-        </w:rPr>
-        <w:t>COVER_FILE = "TODO_COVER_FILENAME"</w:t>
-        <w:br/>
-        <w:t>SECRET_IMAGE = "TODO_SECRET_IMAGE_FILENAME"</w:t>
-      </w:r>
-    </w:p>
-    <w:p>
-      <w:pPr>
-        <w:spacing w:before="0" w:after="160" w:line="276" w:lineRule="auto"/>
-      </w:pPr>
-      <w:r>
-        <w:rPr>
-          <w:rFonts w:ascii="Arial" w:hAnsi="Arial" w:cs="Arial"/>
-          <w:b w:val="0"/>
-          <w:i w:val="0"/>
-          <w:sz w:val="22"/>
-        </w:rPr>
-        <w:t>Sửa thành:</w:t>
-      </w:r>
-    </w:p>
-    <w:p>
-      <w:pPr>
-        <w:spacing w:before="60" w:after="160" w:line="240" w:lineRule="auto"/>
-        <w:ind w:left="360" w:right="360"/>
-        <w:shd w:fill="F5F5F5"/>
+        <w:shd w:fill="F3F4F6"/>
       </w:pPr>
       <w:r>
         <w:rPr>
@@ -838,14 +459,29 @@
           <w:i w:val="0"/>
           <w:sz w:val="22"/>
         </w:rPr>
-        <w:t>Trong file cũng có sẵn:</w:t>
+        <w:t>Giu nguyen PERMUTATION_KEY = 3101.</w:t>
+      </w:r>
+    </w:p>
+    <w:p>
+      <w:pPr>
+        <w:spacing w:before="160" w:after="80" w:line="240" w:lineRule="auto"/>
+      </w:pPr>
+      <w:r>
+        <w:rPr>
+          <w:rFonts w:ascii="Arial" w:hAnsi="Arial" w:cs="Arial"/>
+          <w:b/>
+          <w:i w:val="0"/>
+          <w:color w:val="374151"/>
+          <w:sz w:val="22"/>
+        </w:rPr>
+        <w:t>Task 4: Nhung anh vao audio</w:t>
       </w:r>
     </w:p>
     <w:p>
       <w:pPr>
         <w:spacing w:before="60" w:after="160" w:line="240" w:lineRule="auto"/>
         <w:ind w:left="360" w:right="360"/>
-        <w:shd w:fill="F5F5F5"/>
+        <w:shd w:fill="F3F4F6"/>
       </w:pPr>
       <w:r>
         <w:rPr>
@@ -854,7 +490,75 @@
           <w:i w:val="0"/>
           <w:sz w:val="20"/>
         </w:rPr>
-        <w:t>PERMUTATION_KEY = 3101</w:t>
+        <w:t>python3 embed_task.py</w:t>
+        <w:br/>
+        <w:t>ls -l stego.wav</w:t>
+      </w:r>
+    </w:p>
+    <w:p>
+      <w:pPr>
+        <w:spacing w:before="160" w:after="80" w:line="240" w:lineRule="auto"/>
+      </w:pPr>
+      <w:r>
+        <w:rPr>
+          <w:rFonts w:ascii="Arial" w:hAnsi="Arial" w:cs="Arial"/>
+          <w:b/>
+          <w:i w:val="0"/>
+          <w:color w:val="374151"/>
+          <w:sz w:val="22"/>
+        </w:rPr>
+        <w:t>Task 5: Phan tich su khac biet</w:t>
+      </w:r>
+    </w:p>
+    <w:p>
+      <w:pPr>
+        <w:spacing w:before="60" w:after="160" w:line="240" w:lineRule="auto"/>
+        <w:ind w:left="360" w:right="360"/>
+        <w:shd w:fill="F3F4F6"/>
+      </w:pPr>
+      <w:r>
+        <w:rPr>
+          <w:rFonts w:ascii="Consolas" w:hAnsi="Consolas" w:cs="Consolas"/>
+          <w:b w:val="0"/>
+          <w:i w:val="0"/>
+          <w:sz w:val="20"/>
+        </w:rPr>
+        <w:t>python3 analyze_audio.py --cover cover.wav --stego stego.wav</w:t>
+        <w:br/>
+        <w:t>cmp cover.wav stego.wav</w:t>
+      </w:r>
+    </w:p>
+    <w:p>
+      <w:pPr>
+        <w:spacing w:before="160" w:after="80" w:line="240" w:lineRule="auto"/>
+      </w:pPr>
+      <w:r>
+        <w:rPr>
+          <w:rFonts w:ascii="Arial" w:hAnsi="Arial" w:cs="Arial"/>
+          <w:b/>
+          <w:i w:val="0"/>
+          <w:color w:val="374151"/>
+          <w:sz w:val="22"/>
+        </w:rPr>
+        <w:t>Task 6: Nghe truc tiep audio</w:t>
+      </w:r>
+    </w:p>
+    <w:p>
+      <w:pPr>
+        <w:spacing w:before="60" w:after="160" w:line="240" w:lineRule="auto"/>
+        <w:ind w:left="360" w:right="360"/>
+        <w:shd w:fill="F3F4F6"/>
+      </w:pPr>
+      <w:r>
+        <w:rPr>
+          <w:rFonts w:ascii="Consolas" w:hAnsi="Consolas" w:cs="Consolas"/>
+          <w:b w:val="0"/>
+          <w:i w:val="0"/>
+          <w:sz w:val="20"/>
+        </w:rPr>
+        <w:t>./play_cover.sh</w:t>
+        <w:br/>
+        <w:t>./play_stego.sh</w:t>
       </w:r>
     </w:p>
     <w:p>
@@ -868,385 +572,29 @@
           <w:i w:val="0"/>
           <w:sz w:val="22"/>
         </w:rPr>
-        <w:t>Sinh viên giữ nguyên khóa này để dùng cho bước hoán vị ảnh trước khi nhúng. Lưu file và thoát khỏi nano.</w:t>
+        <w:t>Neu moi truong khong phat am thanh duoc, van co the dung analyze_audio.py de kiem tra.</w:t>
       </w:r>
     </w:p>
     <w:p>
       <w:pPr>
-        <w:pStyle w:val="Heading3"/>
-        <w:spacing w:before="200" w:after="80"/>
+        <w:spacing w:before="200" w:after="120" w:line="240" w:lineRule="auto"/>
       </w:pPr>
       <w:r>
         <w:rPr>
           <w:rFonts w:ascii="Arial" w:hAnsi="Arial" w:cs="Arial"/>
           <w:b/>
           <w:i w:val="0"/>
-          <w:sz w:val="24"/>
+          <w:color w:val="1F2937"/>
+          <w:sz w:val="26"/>
         </w:rPr>
-        <w:t>Task 4: Chạy chương trình nhúng tin</w:t>
-      </w:r>
-    </w:p>
-    <w:p>
-      <w:pPr>
-        <w:spacing w:before="0" w:after="160" w:line="276" w:lineRule="auto"/>
-      </w:pPr>
-      <w:r>
-        <w:rPr>
-          <w:rFonts w:ascii="Arial" w:hAnsi="Arial" w:cs="Arial"/>
-          <w:b w:val="0"/>
-          <w:i w:val="0"/>
-          <w:sz w:val="22"/>
-        </w:rPr>
-        <w:t>Trong terminal của lab, gõ:</w:t>
+        <w:t>Checkwork</w:t>
       </w:r>
     </w:p>
     <w:p>
       <w:pPr>
         <w:spacing w:before="60" w:after="160" w:line="240" w:lineRule="auto"/>
         <w:ind w:left="360" w:right="360"/>
-        <w:shd w:fill="F5F5F5"/>
-      </w:pPr>
-      <w:r>
-        <w:rPr>
-          <w:rFonts w:ascii="Consolas" w:hAnsi="Consolas" w:cs="Consolas"/>
-          <w:b w:val="0"/>
-          <w:i w:val="0"/>
-          <w:sz w:val="20"/>
-        </w:rPr>
-        <w:t>python3 embed_task.py</w:t>
-      </w:r>
-    </w:p>
-    <w:p>
-      <w:pPr>
-        <w:spacing w:before="0" w:after="160" w:line="276" w:lineRule="auto"/>
-      </w:pPr>
-      <w:r>
-        <w:rPr>
-          <w:rFonts w:ascii="Arial" w:hAnsi="Arial" w:cs="Arial"/>
-          <w:b w:val="0"/>
-          <w:i w:val="0"/>
-          <w:sz w:val="22"/>
-        </w:rPr>
-        <w:t>Lệnh này sẽ gọi spectrogram_dwt_stego.py để thực hiện toàn bộ quy trình nhúng ảnh vào audio:</w:t>
-      </w:r>
-    </w:p>
-    <w:p>
-      <w:pPr>
-        <w:pStyle w:val="ListNumber"/>
-        <w:spacing w:before="0" w:after="80" w:line="276" w:lineRule="auto"/>
-      </w:pPr>
-      <w:r>
-        <w:rPr>
-          <w:rFonts w:ascii="Arial" w:hAnsi="Arial" w:cs="Arial"/>
-          <w:b w:val="0"/>
-          <w:i w:val="0"/>
-          <w:sz w:val="22"/>
-        </w:rPr>
-        <w:t>Đọc ảnh secret.png.</w:t>
-      </w:r>
-    </w:p>
-    <w:p>
-      <w:pPr>
-        <w:pStyle w:val="ListNumber"/>
-        <w:spacing w:before="0" w:after="80" w:line="276" w:lineRule="auto"/>
-      </w:pPr>
-      <w:r>
-        <w:rPr>
-          <w:rFonts w:ascii="Arial" w:hAnsi="Arial" w:cs="Arial"/>
-          <w:b w:val="0"/>
-          <w:i w:val="0"/>
-          <w:sz w:val="22"/>
-        </w:rPr>
-        <w:t>Hoán vị ảnh bằng khóa chia sẻ.</w:t>
-      </w:r>
-    </w:p>
-    <w:p>
-      <w:pPr>
-        <w:pStyle w:val="ListNumber"/>
-        <w:spacing w:before="0" w:after="80" w:line="276" w:lineRule="auto"/>
-      </w:pPr>
-      <w:r>
-        <w:rPr>
-          <w:rFonts w:ascii="Arial" w:hAnsi="Arial" w:cs="Arial"/>
-          <w:b w:val="0"/>
-          <w:i w:val="0"/>
-          <w:sz w:val="22"/>
-        </w:rPr>
-        <w:t>Chuẩn hóa ảnh thành ma trận spectrogram.</w:t>
-      </w:r>
-    </w:p>
-    <w:p>
-      <w:pPr>
-        <w:pStyle w:val="ListNumber"/>
-        <w:spacing w:before="0" w:after="80" w:line="276" w:lineRule="auto"/>
-      </w:pPr>
-      <w:r>
-        <w:rPr>
-          <w:rFonts w:ascii="Arial" w:hAnsi="Arial" w:cs="Arial"/>
-          <w:b w:val="0"/>
-          <w:i w:val="0"/>
-          <w:sz w:val="22"/>
-        </w:rPr>
-        <w:t>Dùng Inverse STFT để tạo tín hiệu miền thời gian từ ảnh.</w:t>
-      </w:r>
-    </w:p>
-    <w:p>
-      <w:pPr>
-        <w:pStyle w:val="ListNumber"/>
-        <w:spacing w:before="0" w:after="80" w:line="276" w:lineRule="auto"/>
-      </w:pPr>
-      <w:r>
-        <w:rPr>
-          <w:rFonts w:ascii="Arial" w:hAnsi="Arial" w:cs="Arial"/>
-          <w:b w:val="0"/>
-          <w:i w:val="0"/>
-          <w:sz w:val="22"/>
-        </w:rPr>
-        <w:t>Dùng DWT nhiều mức để tách cover.wav thành hệ số xấp xỉ và các hệ số chi tiết.</w:t>
-      </w:r>
-    </w:p>
-    <w:p>
-      <w:pPr>
-        <w:pStyle w:val="ListNumber"/>
-        <w:spacing w:before="0" w:after="80" w:line="276" w:lineRule="auto"/>
-      </w:pPr>
-      <w:r>
-        <w:rPr>
-          <w:rFonts w:ascii="Arial" w:hAnsi="Arial" w:cs="Arial"/>
-          <w:b w:val="0"/>
-          <w:i w:val="0"/>
-          <w:sz w:val="22"/>
-        </w:rPr>
-        <w:t>Ghi đè hệ số chi tiết ở mức cuối bằng tín hiệu bí mật đã scale.</w:t>
-      </w:r>
-    </w:p>
-    <w:p>
-      <w:pPr>
-        <w:pStyle w:val="ListNumber"/>
-        <w:spacing w:before="0" w:after="80" w:line="276" w:lineRule="auto"/>
-      </w:pPr>
-      <w:r>
-        <w:rPr>
-          <w:rFonts w:ascii="Arial" w:hAnsi="Arial" w:cs="Arial"/>
-          <w:b w:val="0"/>
-          <w:i w:val="0"/>
-          <w:sz w:val="22"/>
-        </w:rPr>
-        <w:t>Dùng IDWT để tạo file stego.wav.</w:t>
-      </w:r>
-    </w:p>
-    <w:p>
-      <w:pPr>
-        <w:spacing w:before="0" w:after="160" w:line="276" w:lineRule="auto"/>
-      </w:pPr>
-      <w:r>
-        <w:rPr>
-          <w:rFonts w:ascii="Arial" w:hAnsi="Arial" w:cs="Arial"/>
-          <w:b w:val="0"/>
-          <w:i w:val="0"/>
-          <w:sz w:val="22"/>
-        </w:rPr>
-        <w:t>Kiểm tra file kết quả:</w:t>
-      </w:r>
-    </w:p>
-    <w:p>
-      <w:pPr>
-        <w:spacing w:before="60" w:after="160" w:line="240" w:lineRule="auto"/>
-        <w:ind w:left="360" w:right="360"/>
-        <w:shd w:fill="F5F5F5"/>
-      </w:pPr>
-      <w:r>
-        <w:rPr>
-          <w:rFonts w:ascii="Consolas" w:hAnsi="Consolas" w:cs="Consolas"/>
-          <w:b w:val="0"/>
-          <w:i w:val="0"/>
-          <w:sz w:val="20"/>
-        </w:rPr>
-        <w:t>ls -l stego.wav</w:t>
-      </w:r>
-    </w:p>
-    <w:p>
-      <w:pPr>
-        <w:pStyle w:val="Heading3"/>
-        <w:spacing w:before="200" w:after="80"/>
-      </w:pPr>
-      <w:r>
-        <w:rPr>
-          <w:rFonts w:ascii="Arial" w:hAnsi="Arial" w:cs="Arial"/>
-          <w:b/>
-          <w:i w:val="0"/>
-          <w:sz w:val="24"/>
-        </w:rPr>
-        <w:t>Task 5: Kiểm tra sự thay đổi giữa cover và stego</w:t>
-      </w:r>
-    </w:p>
-    <w:p>
-      <w:pPr>
-        <w:spacing w:before="0" w:after="160" w:line="276" w:lineRule="auto"/>
-      </w:pPr>
-      <w:r>
-        <w:rPr>
-          <w:rFonts w:ascii="Arial" w:hAnsi="Arial" w:cs="Arial"/>
-          <w:b w:val="0"/>
-          <w:i w:val="0"/>
-          <w:sz w:val="22"/>
-        </w:rPr>
-        <w:t>Gõ lệnh:</w:t>
-      </w:r>
-    </w:p>
-    <w:p>
-      <w:pPr>
-        <w:spacing w:before="60" w:after="160" w:line="240" w:lineRule="auto"/>
-        <w:ind w:left="360" w:right="360"/>
-        <w:shd w:fill="F5F5F5"/>
-      </w:pPr>
-      <w:r>
-        <w:rPr>
-          <w:rFonts w:ascii="Consolas" w:hAnsi="Consolas" w:cs="Consolas"/>
-          <w:b w:val="0"/>
-          <w:i w:val="0"/>
-          <w:sz w:val="20"/>
-        </w:rPr>
-        <w:t>python3 analyze_audio.py --cover cover.wav --stego stego.wav</w:t>
-      </w:r>
-    </w:p>
-    <w:p>
-      <w:pPr>
-        <w:spacing w:before="0" w:after="160" w:line="276" w:lineRule="auto"/>
-      </w:pPr>
-      <w:r>
-        <w:rPr>
-          <w:rFonts w:ascii="Arial" w:hAnsi="Arial" w:cs="Arial"/>
-          <w:b w:val="0"/>
-          <w:i w:val="0"/>
-          <w:sz w:val="22"/>
-        </w:rPr>
-        <w:t>Có thể kiểm tra thêm bằng lệnh:</w:t>
-      </w:r>
-    </w:p>
-    <w:p>
-      <w:pPr>
-        <w:spacing w:before="60" w:after="160" w:line="240" w:lineRule="auto"/>
-        <w:ind w:left="360" w:right="360"/>
-        <w:shd w:fill="F5F5F5"/>
-      </w:pPr>
-      <w:r>
-        <w:rPr>
-          <w:rFonts w:ascii="Consolas" w:hAnsi="Consolas" w:cs="Consolas"/>
-          <w:b w:val="0"/>
-          <w:i w:val="0"/>
-          <w:sz w:val="20"/>
-        </w:rPr>
-        <w:t>cmp cover.wav stego.wav</w:t>
-      </w:r>
-    </w:p>
-    <w:p>
-      <w:pPr>
-        <w:spacing w:before="0" w:after="160" w:line="276" w:lineRule="auto"/>
-      </w:pPr>
-      <w:r>
-        <w:rPr>
-          <w:rFonts w:ascii="Arial" w:hAnsi="Arial" w:cs="Arial"/>
-          <w:b w:val="0"/>
-          <w:i w:val="0"/>
-          <w:sz w:val="22"/>
-        </w:rPr>
-        <w:t>Nếu hai file khác nhau, điều đó chứng tỏ ảnh bí mật đã được nhúng vào audio.</w:t>
-      </w:r>
-    </w:p>
-    <w:p>
-      <w:pPr>
-        <w:pStyle w:val="Heading3"/>
-        <w:spacing w:before="200" w:after="80"/>
-      </w:pPr>
-      <w:r>
-        <w:rPr>
-          <w:rFonts w:ascii="Arial" w:hAnsi="Arial" w:cs="Arial"/>
-          <w:b/>
-          <w:i w:val="0"/>
-          <w:sz w:val="24"/>
-        </w:rPr>
-        <w:t>Task 6: Nghe thử audio stego</w:t>
-      </w:r>
-    </w:p>
-    <w:p>
-      <w:pPr>
-        <w:spacing w:before="0" w:after="160" w:line="276" w:lineRule="auto"/>
-      </w:pPr>
-      <w:r>
-        <w:rPr>
-          <w:rFonts w:ascii="Arial" w:hAnsi="Arial" w:cs="Arial"/>
-          <w:b w:val="0"/>
-          <w:i w:val="0"/>
-          <w:sz w:val="22"/>
-        </w:rPr>
-        <w:t>Nếu môi trường hỗ trợ phát âm thanh, sinh viên có thể nghe thử:</w:t>
-      </w:r>
-    </w:p>
-    <w:p>
-      <w:pPr>
-        <w:spacing w:before="60" w:after="160" w:line="240" w:lineRule="auto"/>
-        <w:ind w:left="360" w:right="360"/>
-        <w:shd w:fill="F5F5F5"/>
-      </w:pPr>
-      <w:r>
-        <w:rPr>
-          <w:rFonts w:ascii="Consolas" w:hAnsi="Consolas" w:cs="Consolas"/>
-          <w:b w:val="0"/>
-          <w:i w:val="0"/>
-          <w:sz w:val="20"/>
-        </w:rPr>
-        <w:t>aplay stego.wav</w:t>
-      </w:r>
-    </w:p>
-    <w:p>
-      <w:pPr>
-        <w:spacing w:before="0" w:after="160" w:line="276" w:lineRule="auto"/>
-      </w:pPr>
-      <w:r>
-        <w:rPr>
-          <w:rFonts w:ascii="Arial" w:hAnsi="Arial" w:cs="Arial"/>
-          <w:b w:val="0"/>
-          <w:i w:val="0"/>
-          <w:sz w:val="22"/>
-        </w:rPr>
-        <w:t>Nếu môi trường không hỗ trợ phát âm thanh, chỉ cần kiểm tra file bằng ls, file và analyze_audio.py.</w:t>
-      </w:r>
-    </w:p>
-    <w:p>
-      <w:pPr>
-        <w:pStyle w:val="Heading2"/>
-        <w:spacing w:before="280" w:after="120"/>
-      </w:pPr>
-      <w:r>
-        <w:rPr>
-          <w:rFonts w:ascii="Arial" w:hAnsi="Arial" w:cs="Arial"/>
-          <w:b/>
-          <w:i w:val="0"/>
-          <w:sz w:val="28"/>
-        </w:rPr>
-        <w:t>Kiểm tra kết quả</w:t>
-      </w:r>
-    </w:p>
-    <w:p>
-      <w:pPr>
-        <w:spacing w:before="0" w:after="160" w:line="276" w:lineRule="auto"/>
-      </w:pPr>
-      <w:r>
-        <w:rPr>
-          <w:rFonts w:ascii="Arial" w:hAnsi="Arial" w:cs="Arial"/>
-          <w:b w:val="0"/>
-          <w:i w:val="0"/>
-          <w:sz w:val="22"/>
-        </w:rPr>
-        <w:t>Trên terminal chính của lab, gõ:</w:t>
-      </w:r>
-    </w:p>
-    <w:p>
-      <w:pPr>
-        <w:spacing w:before="60" w:after="160" w:line="240" w:lineRule="auto"/>
-        <w:ind w:left="360" w:right="360"/>
-        <w:shd w:fill="F5F5F5"/>
+        <w:shd w:fill="F3F4F6"/>
       </w:pPr>
       <w:r>
         <w:rPr>
@@ -1269,14 +617,14 @@
           <w:i w:val="0"/>
           <w:sz w:val="22"/>
         </w:rPr>
-        <w:t>Kết quả đúng cần có:</w:t>
+        <w:t>Ket qua dung can co:</w:t>
       </w:r>
     </w:p>
     <w:p>
       <w:pPr>
         <w:spacing w:before="60" w:after="160" w:line="240" w:lineRule="auto"/>
         <w:ind w:left="360" w:right="360"/>
-        <w:shd w:fill="F5F5F5"/>
+        <w:shd w:fill="F3F4F6"/>
       </w:pPr>
       <w:r>
         <w:rPr>
@@ -1288,6 +636,8 @@
         <w:t>Y - cover_created</w:t>
         <w:br/>
         <w:t>Y - secret_image_created</w:t>
+        <w:br/>
+        <w:t>Y - secret_image_viewed</w:t>
         <w:br/>
         <w:t>Y - image_processed</w:t>
         <w:br/>
@@ -1302,7 +652,8 @@
     </w:p>
     <w:p>
       <w:pPr>
-        <w:spacing w:before="0" w:after="160" w:line="276" w:lineRule="auto"/>
+        <w:pStyle w:val="ListBullet"/>
+        <w:spacing w:before="0" w:after="80" w:line="276" w:lineRule="auto"/>
       </w:pPr>
       <w:r>
         <w:rPr>
@@ -1311,7 +662,7 @@
           <w:i w:val="0"/>
           <w:sz w:val="22"/>
         </w:rPr>
-        <w:t>Ý nghĩa các mục chấm:</w:t>
+        <w:t>cover_created: da tao cover.wav.</w:t>
       </w:r>
     </w:p>
     <w:p>
@@ -1326,7 +677,7 @@
           <w:i w:val="0"/>
           <w:sz w:val="22"/>
         </w:rPr>
-        <w:t>cover_created: đã tạo file audio gốc cover.wav.</w:t>
+        <w:t>secret_image_created: da tao secret.png.</w:t>
       </w:r>
     </w:p>
     <w:p>
@@ -1341,7 +692,7 @@
           <w:i w:val="0"/>
           <w:sz w:val="22"/>
         </w:rPr>
-        <w:t>secret_image_created: đã tạo file ảnh bí mật secret.png.</w:t>
+        <w:t>secret_image_viewed: da mo truc tiep secret.png trong lab.</w:t>
       </w:r>
     </w:p>
     <w:p>
@@ -1356,7 +707,7 @@
           <w:i w:val="0"/>
           <w:sz w:val="22"/>
         </w:rPr>
-        <w:t>image_processed: ảnh bí mật đã được đọc, hoán vị bằng khóa và chuẩn hóa để dùng như spectrogram.</w:t>
+        <w:t>image_processed: anh da duoc doc va chuan hoa de nhung.</w:t>
       </w:r>
     </w:p>
     <w:p>
@@ -1371,7 +722,7 @@
           <w:i w:val="0"/>
           <w:sz w:val="22"/>
         </w:rPr>
-        <w:t>istft_signal_created: đã dùng Inverse STFT để biến spectrogram từ ảnh thành tín hiệu miền thời gian.</w:t>
+        <w:t>istft_signal_created: da tao tin hieu mien thoi gian bang Inverse STFT.</w:t>
       </w:r>
     </w:p>
     <w:p>
@@ -1386,7 +737,7 @@
           <w:i w:val="0"/>
           <w:sz w:val="22"/>
         </w:rPr>
-        <w:t>dwt_highfreq_embedded: đã dùng DWT nhiều mức trên audio gốc và ghi đè tín hiệu bí mật vào hệ số chi tiết của mức phân rã cuối.</w:t>
+        <w:t>dwt_highfreq_embedded: da nhung tin hieu vao he so tan so cao cua DWT.</w:t>
       </w:r>
     </w:p>
     <w:p>
@@ -1401,7 +752,7 @@
           <w:i w:val="0"/>
           <w:sz w:val="22"/>
         </w:rPr>
-        <w:t>stego_created: đã chạy chương trình nhúng tin và tạo stego.wav.</w:t>
+        <w:t>stego_created: da tao stego.wav.</w:t>
       </w:r>
     </w:p>
     <w:p>
@@ -1416,43 +767,29 @@
           <w:i w:val="0"/>
           <w:sz w:val="22"/>
         </w:rPr>
-        <w:t>audio_modified: stego.wav khác cover.wav, chứng tỏ quá trình nhúng đã làm thay đổi tín hiệu audio.</w:t>
+        <w:t>audio_modified: stego.wav khac cover.wav.</w:t>
       </w:r>
     </w:p>
     <w:p>
       <w:pPr>
-        <w:pStyle w:val="Heading2"/>
-        <w:spacing w:before="280" w:after="120"/>
+        <w:spacing w:before="200" w:after="120" w:line="240" w:lineRule="auto"/>
       </w:pPr>
       <w:r>
         <w:rPr>
           <w:rFonts w:ascii="Arial" w:hAnsi="Arial" w:cs="Arial"/>
           <w:b/>
           <w:i w:val="0"/>
-          <w:sz w:val="28"/>
+          <w:color w:val="1F2937"/>
+          <w:sz w:val="26"/>
         </w:rPr>
-        <w:t>Kết thúc bài lab</w:t>
-      </w:r>
-    </w:p>
-    <w:p>
-      <w:pPr>
-        <w:spacing w:before="0" w:after="160" w:line="276" w:lineRule="auto"/>
-      </w:pPr>
-      <w:r>
-        <w:rPr>
-          <w:rFonts w:ascii="Arial" w:hAnsi="Arial" w:cs="Arial"/>
-          <w:b w:val="0"/>
-          <w:i w:val="0"/>
-          <w:sz w:val="22"/>
-        </w:rPr>
-        <w:t>Trên terminal chính, gõ:</w:t>
+        <w:t>Ket thuc</w:t>
       </w:r>
     </w:p>
     <w:p>
       <w:pPr>
         <w:spacing w:before="60" w:after="160" w:line="240" w:lineRule="auto"/>
         <w:ind w:left="360" w:right="360"/>
-        <w:shd w:fill="F5F5F5"/>
+        <w:shd w:fill="F3F4F6"/>
       </w:pPr>
       <w:r>
         <w:rPr>
@@ -1475,58 +812,12 @@
           <w:i w:val="0"/>
           <w:sz w:val="22"/>
         </w:rPr>
-        <w:t>Kết quả sẽ được lưu tại:</w:t>
-      </w:r>
-    </w:p>
-    <w:p>
-      <w:pPr>
-        <w:spacing w:before="60" w:after="160" w:line="240" w:lineRule="auto"/>
-        <w:ind w:left="360" w:right="360"/>
-        <w:shd w:fill="F5F5F5"/>
-      </w:pPr>
-      <w:r>
-        <w:rPr>
-          <w:rFonts w:ascii="Consolas" w:hAnsi="Consolas" w:cs="Consolas"/>
-          <w:b w:val="0"/>
-          <w:i w:val="0"/>
-          <w:sz w:val="20"/>
-        </w:rPr>
-        <w:t>/home/student/labtainer_xfer/audio-spectrogram-dwt</w:t>
-      </w:r>
-    </w:p>
-    <w:p>
-      <w:pPr>
-        <w:spacing w:before="0" w:after="160" w:line="276" w:lineRule="auto"/>
-      </w:pPr>
-      <w:r>
-        <w:rPr>
-          <w:rFonts w:ascii="Arial" w:hAnsi="Arial" w:cs="Arial"/>
-          <w:b w:val="0"/>
-          <w:i w:val="0"/>
-          <w:sz w:val="22"/>
-        </w:rPr>
-        <w:t>Tên file bài làm sẽ có dạng:</w:t>
-      </w:r>
-    </w:p>
-    <w:p>
-      <w:pPr>
-        <w:spacing w:before="60" w:after="160" w:line="240" w:lineRule="auto"/>
-        <w:ind w:left="360" w:right="360"/>
-        <w:shd w:fill="F5F5F5"/>
-      </w:pPr>
-      <w:r>
-        <w:rPr>
-          <w:rFonts w:ascii="Consolas" w:hAnsi="Consolas" w:cs="Consolas"/>
-          <w:b w:val="0"/>
-          <w:i w:val="0"/>
-          <w:sz w:val="20"/>
-        </w:rPr>
-        <w:t>B22DCAT311.audio-spectrogram-dwt.lab</w:t>
+        <w:t>Ket qua duoc luu trong /home/student/labtainer_xfer/audio-spectrogram-dwt va file bai lam co dang B22DCAT311.audio-spectrogram-dwt.lab.</w:t>
       </w:r>
     </w:p>
     <w:sectPr>
       <w:pgSz w:w="12240" w:h="15840"/>
-      <w:pgMar w:top="1440" w:right="1440" w:bottom="1440" w:left="1440" w:header="720" w:footer="720" w:gutter="0"/>
+      <w:pgMar w:top="1008" w:right="1152" w:bottom="1008" w:left="1152" w:header="720" w:footer="720" w:gutter="0"/>
       <w:cols w:space="720"/>
       <w:docGrid w:linePitch="360"/>
     </w:sectPr>
@@ -1897,10 +1188,6 @@
     <w:name w:val="Normal"/>
     <w:qFormat/>
     <w:rsid w:val="00FC693F"/>
-    <w:rPr>
-      <w:rFonts w:ascii="Arial" w:hAnsi="Arial" w:cs="Arial"/>
-      <w:sz w:val="22"/>
-    </w:rPr>
   </w:style>
   <w:style w:type="paragraph" w:styleId="Header">
     <w:name w:val="header"/>
@@ -1961,11 +1248,11 @@
       <w:outlineLvl w:val="0"/>
     </w:pPr>
     <w:rPr>
-      <w:rFonts w:asciiTheme="majorHAnsi" w:eastAsiaTheme="majorEastAsia" w:hAnsiTheme="majorHAnsi" w:cstheme="majorBidi" w:ascii="Arial" w:hAnsi="Arial" w:cs="Arial"/>
+      <w:rFonts w:asciiTheme="majorHAnsi" w:eastAsiaTheme="majorEastAsia" w:hAnsiTheme="majorHAnsi" w:cstheme="majorBidi"/>
       <w:b/>
       <w:bCs/>
-      <w:color w:val="000000"/>
-      <w:sz w:val="32"/>
+      <w:color w:val="365F91" w:themeColor="accent1" w:themeShade="BF"/>
+      <w:sz w:val="28"/>
       <w:szCs w:val="28"/>
     </w:rPr>
   </w:style>
@@ -1985,11 +1272,11 @@
       <w:outlineLvl w:val="1"/>
     </w:pPr>
     <w:rPr>
-      <w:rFonts w:asciiTheme="majorHAnsi" w:eastAsiaTheme="majorEastAsia" w:hAnsiTheme="majorHAnsi" w:cstheme="majorBidi" w:ascii="Arial" w:hAnsi="Arial" w:cs="Arial"/>
+      <w:rFonts w:asciiTheme="majorHAnsi" w:eastAsiaTheme="majorEastAsia" w:hAnsiTheme="majorHAnsi" w:cstheme="majorBidi"/>
       <w:b/>
       <w:bCs/>
-      <w:color w:val="000000"/>
-      <w:sz w:val="28"/>
+      <w:color w:val="4F81BD" w:themeColor="accent1"/>
+      <w:sz w:val="26"/>
       <w:szCs w:val="26"/>
     </w:rPr>
   </w:style>
@@ -2009,11 +1296,10 @@
       <w:outlineLvl w:val="2"/>
     </w:pPr>
     <w:rPr>
-      <w:rFonts w:asciiTheme="majorHAnsi" w:eastAsiaTheme="majorEastAsia" w:hAnsiTheme="majorHAnsi" w:cstheme="majorBidi" w:ascii="Arial" w:hAnsi="Arial" w:cs="Arial"/>
+      <w:rFonts w:asciiTheme="majorHAnsi" w:eastAsiaTheme="majorEastAsia" w:hAnsiTheme="majorHAnsi" w:cstheme="majorBidi"/>
       <w:b/>
       <w:bCs/>
-      <w:color w:val="000000"/>
-      <w:sz w:val="24"/>
+      <w:color w:val="4F81BD" w:themeColor="accent1"/>
     </w:rPr>
   </w:style>
   <w:style w:type="paragraph" w:styleId="Heading4">
@@ -2251,12 +1537,11 @@
       <w:contextualSpacing/>
     </w:pPr>
     <w:rPr>
-      <w:rFonts w:asciiTheme="majorHAnsi" w:eastAsiaTheme="majorEastAsia" w:hAnsiTheme="majorHAnsi" w:cstheme="majorBidi" w:ascii="Arial" w:hAnsi="Arial" w:cs="Arial"/>
-      <w:b/>
-      <w:color w:val="000000"/>
+      <w:rFonts w:asciiTheme="majorHAnsi" w:eastAsiaTheme="majorEastAsia" w:hAnsiTheme="majorHAnsi" w:cstheme="majorBidi"/>
+      <w:color w:val="17365D" w:themeColor="text2" w:themeShade="BF"/>
       <w:spacing w:val="5"/>
       <w:kern w:val="28"/>
-      <w:sz w:val="48"/>
+      <w:sz w:val="52"/>
       <w:szCs w:val="52"/>
     </w:rPr>
   </w:style>

</xml_diff>

<commit_message>
Split Lab 5 stego workflow into step tasks
</commit_message>
<xml_diff>
--- a/huong-dan-lab5-audio-spectrogram-dwt.docx
+++ b/huong-dan-lab5-audio-spectrogram-dwt.docx
@@ -43,7 +43,7 @@
           <w:i w:val="0"/>
           <w:sz w:val="22"/>
         </w:rPr>
-        <w:t>Bai lab tao cover.wav, tao secret.png, bien anh thanh tin hieu mien thoi gian bang Inverse STFT va nhung vao phan tan so cao cua audio bang DWT.</w:t>
+        <w:t>Bai lab chia quy trinh thanh tung task rieng: tao cover.wav, tao/xem secret.png, xu ly anh thanh ma tran spectrogram, dung Inverse STFT tao hidden_signal.json, nhung vao he so tan so cao bang DWT va IDWT tao stego.wav.</w:t>
       </w:r>
     </w:p>
     <w:p>
@@ -147,7 +147,7 @@
           <w:i w:val="0"/>
           <w:sz w:val="22"/>
         </w:rPr>
-        <w:t>Trong thu muc ~/stego co cac file thuc hanh nhu generate_cover.py, generate_secret_image.py, embed_task.py, analyze_audio.py, refresh_status.py va cac script view/play moi.</w:t>
+        <w:t>Trong thu muc ~/stego co cac script thuc hanh rieng: process_image_task.py, istft_task.py, dwt_embed_task.py, analyze_audio.py, refresh_status.py va cac script view/play.</w:t>
       </w:r>
     </w:p>
     <w:p>
@@ -222,7 +222,7 @@
           <w:i w:val="0"/>
           <w:sz w:val="22"/>
         </w:rPr>
-        <w:t>Sua file embed_task.py, dien dung ten file audio goc va anh bi mat.</w:t>
+        <w:t>Sua process_image_task.py de dien ten anh va key, sau do tao processed_image.json.</w:t>
       </w:r>
     </w:p>
     <w:p>
@@ -237,7 +237,22 @@
           <w:i w:val="0"/>
           <w:sz w:val="22"/>
         </w:rPr>
-        <w:t>Chay chuong trinh nhung tin de tao stego.wav.</w:t>
+        <w:t>Sua istft_task.py de tao hidden_signal.json bang Inverse STFT.</w:t>
+      </w:r>
+    </w:p>
+    <w:p>
+      <w:pPr>
+        <w:pStyle w:val="ListNumber"/>
+        <w:spacing w:before="0" w:after="80" w:line="276" w:lineRule="auto"/>
+      </w:pPr>
+      <w:r>
+        <w:rPr>
+          <w:rFonts w:ascii="Arial" w:hAnsi="Arial" w:cs="Arial"/>
+          <w:b w:val="0"/>
+          <w:i w:val="0"/>
+          <w:sz w:val="22"/>
+        </w:rPr>
+        <w:t>Sua dwt_embed_task.py de nhung hidden_signal.json vao cover.wav va tao stego.wav.</w:t>
       </w:r>
     </w:p>
     <w:p>
@@ -317,7 +332,7 @@
         <w:br/>
         <w:t>python3 generate_cover.py --out cover.wav</w:t>
         <w:br/>
-        <w:t>ls -l cover.wav</w:t>
+        <w:t>checkwork</w:t>
       </w:r>
     </w:p>
     <w:p>
@@ -350,9 +365,9 @@
         </w:rPr>
         <w:t>python3 generate_secret_image.py --out secret.png</w:t>
         <w:br/>
-        <w:t>ls -l secret.png</w:t>
+        <w:t>./view_secret.sh</w:t>
         <w:br/>
-        <w:t>file secret.png</w:t>
+        <w:t>checkwork</w:t>
       </w:r>
     </w:p>
     <w:p>
@@ -397,7 +412,7 @@
           <w:color w:val="374151"/>
           <w:sz w:val="22"/>
         </w:rPr>
-        <w:t>Task 3: Sua embed_task.py</w:t>
+        <w:t>Task 3: Xu ly anh thanh ma tran spectrogram</w:t>
       </w:r>
     </w:p>
     <w:p>
@@ -413,7 +428,7 @@
           <w:i w:val="0"/>
           <w:sz w:val="20"/>
         </w:rPr>
-        <w:t>nano embed_task.py</w:t>
+        <w:t>nano process_image_task.py</w:t>
       </w:r>
     </w:p>
     <w:p>
@@ -427,7 +442,88 @@
           <w:i w:val="0"/>
           <w:sz w:val="22"/>
         </w:rPr>
-        <w:t>Sua hai dong TODO thanh:</w:t>
+        <w:t>Sua TODO thanh:</w:t>
+      </w:r>
+    </w:p>
+    <w:p>
+      <w:pPr>
+        <w:spacing w:before="60" w:after="160" w:line="240" w:lineRule="auto"/>
+        <w:ind w:left="360" w:right="360"/>
+        <w:shd w:fill="F3F4F6"/>
+      </w:pPr>
+      <w:r>
+        <w:rPr>
+          <w:rFonts w:ascii="Consolas" w:hAnsi="Consolas" w:cs="Consolas"/>
+          <w:b w:val="0"/>
+          <w:i w:val="0"/>
+          <w:sz w:val="20"/>
+        </w:rPr>
+        <w:t>SECRET_IMAGE = "secret.png"</w:t>
+        <w:br/>
+        <w:t>PERMUTATION_KEY = 3101</w:t>
+      </w:r>
+    </w:p>
+    <w:p>
+      <w:pPr>
+        <w:spacing w:before="60" w:after="160" w:line="240" w:lineRule="auto"/>
+        <w:ind w:left="360" w:right="360"/>
+        <w:shd w:fill="F3F4F6"/>
+      </w:pPr>
+      <w:r>
+        <w:rPr>
+          <w:rFonts w:ascii="Consolas" w:hAnsi="Consolas" w:cs="Consolas"/>
+          <w:b w:val="0"/>
+          <w:i w:val="0"/>
+          <w:sz w:val="20"/>
+        </w:rPr>
+        <w:t>python3 process_image_task.py</w:t>
+        <w:br/>
+        <w:t>checkwork</w:t>
+      </w:r>
+    </w:p>
+    <w:p>
+      <w:pPr>
+        <w:spacing w:before="160" w:after="80" w:line="240" w:lineRule="auto"/>
+      </w:pPr>
+      <w:r>
+        <w:rPr>
+          <w:rFonts w:ascii="Arial" w:hAnsi="Arial" w:cs="Arial"/>
+          <w:b/>
+          <w:i w:val="0"/>
+          <w:color w:val="374151"/>
+          <w:sz w:val="22"/>
+        </w:rPr>
+        <w:t>Task 4: Inverse STFT tao tin hieu mien thoi gian</w:t>
+      </w:r>
+    </w:p>
+    <w:p>
+      <w:pPr>
+        <w:spacing w:before="60" w:after="160" w:line="240" w:lineRule="auto"/>
+        <w:ind w:left="360" w:right="360"/>
+        <w:shd w:fill="F3F4F6"/>
+      </w:pPr>
+      <w:r>
+        <w:rPr>
+          <w:rFonts w:ascii="Consolas" w:hAnsi="Consolas" w:cs="Consolas"/>
+          <w:b w:val="0"/>
+          <w:i w:val="0"/>
+          <w:sz w:val="20"/>
+        </w:rPr>
+        <w:t>nano istft_task.py</w:t>
+      </w:r>
+    </w:p>
+    <w:p>
+      <w:pPr>
+        <w:spacing w:before="0" w:after="160" w:line="276" w:lineRule="auto"/>
+      </w:pPr>
+      <w:r>
+        <w:rPr>
+          <w:rFonts w:ascii="Arial" w:hAnsi="Arial" w:cs="Arial"/>
+          <w:b w:val="0"/>
+          <w:i w:val="0"/>
+          <w:sz w:val="22"/>
+        </w:rPr>
+        <w:t>Sua TODO thanh:</w:t>
       </w:r>
     </w:p>
     <w:p>
@@ -445,36 +541,7 @@
         </w:rPr>
         <w:t>COVER_FILE = "cover.wav"</w:t>
         <w:br/>
-        <w:t>SECRET_IMAGE = "secret.png"</w:t>
-      </w:r>
-    </w:p>
-    <w:p>
-      <w:pPr>
-        <w:spacing w:before="0" w:after="160" w:line="276" w:lineRule="auto"/>
-      </w:pPr>
-      <w:r>
-        <w:rPr>
-          <w:rFonts w:ascii="Arial" w:hAnsi="Arial" w:cs="Arial"/>
-          <w:b w:val="0"/>
-          <w:i w:val="0"/>
-          <w:sz w:val="22"/>
-        </w:rPr>
-        <w:t>Giu nguyen PERMUTATION_KEY = 3101.</w:t>
-      </w:r>
-    </w:p>
-    <w:p>
-      <w:pPr>
-        <w:spacing w:before="160" w:after="80" w:line="240" w:lineRule="auto"/>
-      </w:pPr>
-      <w:r>
-        <w:rPr>
-          <w:rFonts w:ascii="Arial" w:hAnsi="Arial" w:cs="Arial"/>
-          <w:b/>
-          <w:i w:val="0"/>
-          <w:color w:val="374151"/>
-          <w:sz w:val="22"/>
-        </w:rPr>
-        <w:t>Task 4: Nhung anh vao audio</w:t>
+        <w:t>PROCESSED_IMAGE = "processed_image.json"</w:t>
       </w:r>
     </w:p>
     <w:p>
@@ -490,9 +557,9 @@
           <w:i w:val="0"/>
           <w:sz w:val="20"/>
         </w:rPr>
-        <w:t>python3 embed_task.py</w:t>
+        <w:t>python3 istft_task.py</w:t>
         <w:br/>
-        <w:t>ls -l stego.wav</w:t>
+        <w:t>checkwork</w:t>
       </w:r>
     </w:p>
     <w:p>
@@ -507,7 +574,7 @@
           <w:color w:val="374151"/>
           <w:sz w:val="22"/>
         </w:rPr>
-        <w:t>Task 5: Phan tich su khac biet</w:t>
+        <w:t>Task 5: Nhung tin hieu vao audio bang DWT</w:t>
       </w:r>
     </w:p>
     <w:p>
@@ -523,9 +590,57 @@
           <w:i w:val="0"/>
           <w:sz w:val="20"/>
         </w:rPr>
-        <w:t>python3 analyze_audio.py --cover cover.wav --stego stego.wav</w:t>
+        <w:t>nano dwt_embed_task.py</w:t>
+      </w:r>
+    </w:p>
+    <w:p>
+      <w:pPr>
+        <w:spacing w:before="0" w:after="160" w:line="276" w:lineRule="auto"/>
+      </w:pPr>
+      <w:r>
+        <w:rPr>
+          <w:rFonts w:ascii="Arial" w:hAnsi="Arial" w:cs="Arial"/>
+          <w:b w:val="0"/>
+          <w:i w:val="0"/>
+          <w:sz w:val="22"/>
+        </w:rPr>
+        <w:t>Sua TODO thanh:</w:t>
+      </w:r>
+    </w:p>
+    <w:p>
+      <w:pPr>
+        <w:spacing w:before="60" w:after="160" w:line="240" w:lineRule="auto"/>
+        <w:ind w:left="360" w:right="360"/>
+        <w:shd w:fill="F3F4F6"/>
+      </w:pPr>
+      <w:r>
+        <w:rPr>
+          <w:rFonts w:ascii="Consolas" w:hAnsi="Consolas" w:cs="Consolas"/>
+          <w:b w:val="0"/>
+          <w:i w:val="0"/>
+          <w:sz w:val="20"/>
+        </w:rPr>
+        <w:t>COVER_FILE = "cover.wav"</w:t>
         <w:br/>
-        <w:t>cmp cover.wav stego.wav</w:t>
+        <w:t>HIDDEN_SIGNAL = "hidden_signal.json"</w:t>
+      </w:r>
+    </w:p>
+    <w:p>
+      <w:pPr>
+        <w:spacing w:before="60" w:after="160" w:line="240" w:lineRule="auto"/>
+        <w:ind w:left="360" w:right="360"/>
+        <w:shd w:fill="F3F4F6"/>
+      </w:pPr>
+      <w:r>
+        <w:rPr>
+          <w:rFonts w:ascii="Consolas" w:hAnsi="Consolas" w:cs="Consolas"/>
+          <w:b w:val="0"/>
+          <w:i w:val="0"/>
+          <w:sz w:val="20"/>
+        </w:rPr>
+        <w:t>python3 dwt_embed_task.py</w:t>
+        <w:br/>
+        <w:t>checkwork</w:t>
       </w:r>
     </w:p>
     <w:p>
@@ -540,7 +655,7 @@
           <w:color w:val="374151"/>
           <w:sz w:val="22"/>
         </w:rPr>
-        <w:t>Task 6: Nghe truc tiep audio</w:t>
+        <w:t>Task 6: Nghe va kiem tra audio</w:t>
       </w:r>
     </w:p>
     <w:p>
@@ -559,6 +674,10 @@
         <w:t>./play_cover.sh</w:t>
         <w:br/>
         <w:t>./play_stego.sh</w:t>
+        <w:br/>
+        <w:t>python3 analyze_audio.py --cover cover.wav --stego stego.wav</w:t>
+        <w:br/>
+        <w:t>checkwork</w:t>
       </w:r>
     </w:p>
     <w:p>

</xml_diff>

<commit_message>
Rename Lab 5 step scripts
</commit_message>
<xml_diff>
--- a/huong-dan-lab5-audio-spectrogram-dwt.docx
+++ b/huong-dan-lab5-audio-spectrogram-dwt.docx
@@ -147,7 +147,7 @@
           <w:i w:val="0"/>
           <w:sz w:val="22"/>
         </w:rPr>
-        <w:t>Trong thu muc ~/stego co cac script thuc hanh rieng: process_image_task.py, istft_task.py, dwt_embed_task.py, analyze_audio.py, refresh_status.py va cac script view/play.</w:t>
+        <w:t>Trong thu muc ~/stego co cac script thuc hanh rieng: process_image.py, istft.py, dwt_embed.py, analyze_audio.py, refresh_status.py va cac script view/play.</w:t>
       </w:r>
     </w:p>
     <w:p>
@@ -222,7 +222,7 @@
           <w:i w:val="0"/>
           <w:sz w:val="22"/>
         </w:rPr>
-        <w:t>Sua process_image_task.py de dien ten anh va key, sau do tao processed_image.json.</w:t>
+        <w:t>Sua process_image.py de dien ten anh va key, sau do tao processed_image.json.</w:t>
       </w:r>
     </w:p>
     <w:p>
@@ -237,7 +237,7 @@
           <w:i w:val="0"/>
           <w:sz w:val="22"/>
         </w:rPr>
-        <w:t>Sua istft_task.py de tao hidden_signal.json bang Inverse STFT.</w:t>
+        <w:t>Sua istft.py de tao hidden_signal.json bang Inverse STFT.</w:t>
       </w:r>
     </w:p>
     <w:p>
@@ -252,7 +252,7 @@
           <w:i w:val="0"/>
           <w:sz w:val="22"/>
         </w:rPr>
-        <w:t>Sua dwt_embed_task.py de nhung hidden_signal.json vao cover.wav va tao stego.wav.</w:t>
+        <w:t>Sua dwt_embed.py de nhung hidden_signal.json vao cover.wav va tao stego.wav.</w:t>
       </w:r>
     </w:p>
     <w:p>
@@ -428,7 +428,7 @@
           <w:i w:val="0"/>
           <w:sz w:val="20"/>
         </w:rPr>
-        <w:t>nano process_image_task.py</w:t>
+        <w:t>nano process_image.py</w:t>
       </w:r>
     </w:p>
     <w:p>
@@ -476,7 +476,7 @@
           <w:i w:val="0"/>
           <w:sz w:val="20"/>
         </w:rPr>
-        <w:t>python3 process_image_task.py</w:t>
+        <w:t>python3 process_image.py</w:t>
         <w:br/>
         <w:t>checkwork</w:t>
       </w:r>
@@ -509,7 +509,7 @@
           <w:i w:val="0"/>
           <w:sz w:val="20"/>
         </w:rPr>
-        <w:t>nano istft_task.py</w:t>
+        <w:t>nano istft.py</w:t>
       </w:r>
     </w:p>
     <w:p>
@@ -557,7 +557,7 @@
           <w:i w:val="0"/>
           <w:sz w:val="20"/>
         </w:rPr>
-        <w:t>python3 istft_task.py</w:t>
+        <w:t>python3 istft.py</w:t>
         <w:br/>
         <w:t>checkwork</w:t>
       </w:r>
@@ -590,7 +590,7 @@
           <w:i w:val="0"/>
           <w:sz w:val="20"/>
         </w:rPr>
-        <w:t>nano dwt_embed_task.py</w:t>
+        <w:t>nano dwt_embed.py</w:t>
       </w:r>
     </w:p>
     <w:p>
@@ -638,7 +638,7 @@
           <w:i w:val="0"/>
           <w:sz w:val="20"/>
         </w:rPr>
-        <w:t>python3 dwt_embed_task.py</w:t>
+        <w:t>python3 dwt_embed.py</w:t>
         <w:br/>
         <w:t>checkwork</w:t>
       </w:r>

</xml_diff>

<commit_message>
Update Lab 5 guide section labels
</commit_message>
<xml_diff>
--- a/huong-dan-lab5-audio-spectrogram-dwt.docx
+++ b/huong-dan-lab5-audio-spectrogram-dwt.docx
@@ -43,7 +43,7 @@
           <w:i w:val="0"/>
           <w:sz w:val="22"/>
         </w:rPr>
-        <w:t>Bai lab chia quy trinh thanh tung task rieng: tao cover.wav, tao/xem secret.png, xu ly anh thanh ma tran spectrogram, dung Inverse STFT tao hidden_signal.json, nhung vao he so tan so cao bang DWT va IDWT tao stego.wav.</w:t>
+        <w:t>Bai lab chia quy trinh thanh tung phan rieng: tao cover.wav, tao/xem secret.png, xu ly anh thanh ma tran spectrogram, dung Inverse STFT tao hidden_signal.json, nhung vao he so tan so cao bang DWT va IDWT tao stego.wav.</w:t>
       </w:r>
     </w:p>
     <w:p>
@@ -312,7 +312,7 @@
           <w:color w:val="374151"/>
           <w:sz w:val="22"/>
         </w:rPr>
-        <w:t>Task 1: Tao file audio goc</w:t>
+        <w:t>Phan 1: Tao file audio goc</w:t>
       </w:r>
     </w:p>
     <w:p>
@@ -347,7 +347,7 @@
           <w:color w:val="374151"/>
           <w:sz w:val="22"/>
         </w:rPr>
-        <w:t>Task 2: Tao anh bi mat</w:t>
+        <w:t>Phan 2: Tao anh bi mat</w:t>
       </w:r>
     </w:p>
     <w:p>
@@ -412,7 +412,7 @@
           <w:color w:val="374151"/>
           <w:sz w:val="22"/>
         </w:rPr>
-        <w:t>Task 3: Xu ly anh thanh ma tran spectrogram</w:t>
+        <w:t>Phan 3: Xu ly anh thanh ma tran spectrogram</w:t>
       </w:r>
     </w:p>
     <w:p>
@@ -493,7 +493,7 @@
           <w:color w:val="374151"/>
           <w:sz w:val="22"/>
         </w:rPr>
-        <w:t>Task 4: Inverse STFT tao tin hieu mien thoi gian</w:t>
+        <w:t>Phan 4: Inverse STFT tao tin hieu mien thoi gian</w:t>
       </w:r>
     </w:p>
     <w:p>
@@ -574,7 +574,7 @@
           <w:color w:val="374151"/>
           <w:sz w:val="22"/>
         </w:rPr>
-        <w:t>Task 5: Nhung tin hieu vao audio bang DWT</w:t>
+        <w:t>Phan 5: Nhung tin hieu vao audio bang DWT</w:t>
       </w:r>
     </w:p>
     <w:p>
@@ -655,7 +655,7 @@
           <w:color w:val="374151"/>
           <w:sz w:val="22"/>
         </w:rPr>
-        <w:t>Task 6: Nghe va kiem tra audio</w:t>
+        <w:t>Phan 6: Nghe va kiem tra audio</w:t>
       </w:r>
     </w:p>
     <w:p>

</xml_diff>

<commit_message>
Simplify per-task lab instructions
</commit_message>
<xml_diff>
--- a/huong-dan-lab5-audio-spectrogram-dwt.docx
+++ b/huong-dan-lab5-audio-spectrogram-dwt.docx
@@ -152,6 +152,20 @@
     </w:p>
     <w:p>
       <w:pPr>
+        <w:spacing w:before="0" w:after="160" w:line="276" w:lineRule="auto"/>
+      </w:pPr>
+      <w:r>
+        <w:rPr>
+          <w:rFonts w:ascii="Arial" w:hAnsi="Arial" w:cs="Arial"/>
+          <w:b w:val="0"/>
+          <w:i w:val="0"/>
+          <w:sz w:val="22"/>
+        </w:rPr>
+        <w:t>Sinh vien chi can kiem tra lenh cua tung task tao dung file dau ra. Khong can chay checkwork sau tung task; checkwork duoc chay mot lan o cuoi bai.</w:t>
+      </w:r>
+    </w:p>
+    <w:p>
+      <w:pPr>
         <w:spacing w:before="200" w:after="120" w:line="240" w:lineRule="auto"/>
       </w:pPr>
       <w:r>
@@ -297,7 +311,7 @@
           <w:i w:val="0"/>
           <w:sz w:val="22"/>
         </w:rPr>
-        <w:t>Chay checkwork de kiem tra ket qua.</w:t>
+        <w:t>Chay checkwork o cuoi bai de kiem tra ket qua.</w:t>
       </w:r>
     </w:p>
     <w:p>
@@ -332,7 +346,7 @@
         <w:br/>
         <w:t>python3 generate_cover.py --out cover.wav</w:t>
         <w:br/>
-        <w:t>checkwork</w:t>
+        <w:t>ls -l cover.wav</w:t>
       </w:r>
     </w:p>
     <w:p>
@@ -367,7 +381,7 @@
         <w:br/>
         <w:t>./view_secret.sh</w:t>
         <w:br/>
-        <w:t>checkwork</w:t>
+        <w:t>ls -l secret.png</w:t>
       </w:r>
     </w:p>
     <w:p>
@@ -478,7 +492,7 @@
         </w:rPr>
         <w:t>python3 process_image.py</w:t>
         <w:br/>
-        <w:t>checkwork</w:t>
+        <w:t>ls -l processed_image.json</w:t>
       </w:r>
     </w:p>
     <w:p>
@@ -559,7 +573,7 @@
         </w:rPr>
         <w:t>python3 istft.py</w:t>
         <w:br/>
-        <w:t>checkwork</w:t>
+        <w:t>ls -l hidden_signal.json</w:t>
       </w:r>
     </w:p>
     <w:p>
@@ -640,7 +654,7 @@
         </w:rPr>
         <w:t>python3 dwt_embed.py</w:t>
         <w:br/>
-        <w:t>checkwork</w:t>
+        <w:t>ls -l stego.wav</w:t>
       </w:r>
     </w:p>
     <w:p>
@@ -676,8 +690,6 @@
         <w:t>./play_stego.sh</w:t>
         <w:br/>
         <w:t>python3 analyze_audio.py --cover cover.wav --stego stego.wav</w:t>
-        <w:br/>
-        <w:t>checkwork</w:t>
       </w:r>
     </w:p>
     <w:p>

</xml_diff>

<commit_message>
Use empty filename placeholders in Lab 5
</commit_message>
<xml_diff>
--- a/huong-dan-lab5-audio-spectrogram-dwt.docx
+++ b/huong-dan-lab5-audio-spectrogram-dwt.docx
@@ -456,7 +456,7 @@
           <w:i w:val="0"/>
           <w:sz w:val="22"/>
         </w:rPr>
-        <w:t>Sua TODO thanh:</w:t>
+        <w:t>Sua cac chuoi rong thanh:</w:t>
       </w:r>
     </w:p>
     <w:p>
@@ -537,7 +537,7 @@
           <w:i w:val="0"/>
           <w:sz w:val="22"/>
         </w:rPr>
-        <w:t>Sua TODO thanh:</w:t>
+        <w:t>Sua cac chuoi rong thanh:</w:t>
       </w:r>
     </w:p>
     <w:p>
@@ -618,7 +618,7 @@
           <w:i w:val="0"/>
           <w:sz w:val="22"/>
         </w:rPr>
-        <w:t>Sua TODO thanh:</w:t>
+        <w:t>Sua cac chuoi rong thanh:</w:t>
       </w:r>
     </w:p>
     <w:p>

</xml_diff>

<commit_message>
Restore previous Lab 5 guide wording
</commit_message>
<xml_diff>
--- a/huong-dan-lab5-audio-spectrogram-dwt.docx
+++ b/huong-dan-lab5-audio-spectrogram-dwt.docx
@@ -456,7 +456,7 @@
           <w:i w:val="0"/>
           <w:sz w:val="22"/>
         </w:rPr>
-        <w:t>Sua cac chuoi rong thanh:</w:t>
+        <w:t>Sua TODO thanh:</w:t>
       </w:r>
     </w:p>
     <w:p>
@@ -537,7 +537,7 @@
           <w:i w:val="0"/>
           <w:sz w:val="22"/>
         </w:rPr>
-        <w:t>Sua cac chuoi rong thanh:</w:t>
+        <w:t>Sua TODO thanh:</w:t>
       </w:r>
     </w:p>
     <w:p>
@@ -618,7 +618,7 @@
           <w:i w:val="0"/>
           <w:sz w:val="22"/>
         </w:rPr>
-        <w:t>Sua cac chuoi rong thanh:</w:t>
+        <w:t>Sua TODO thanh:</w:t>
       </w:r>
     </w:p>
     <w:p>

</xml_diff>